<commit_message>
Added tooling for typesetting
</commit_message>
<xml_diff>
--- a/Files/01 - Bereshis/01 - Bereshis/5786/Bereshis (1)/Bereshis 5786 (1).docx
+++ b/Files/01 - Bereshis/01 - Bereshis/5786/Bereshis (1)/Bereshis 5786 (1).docx
@@ -821,7 +821,7 @@
         <w:rPr>
           <w:rFonts w:ascii="Times New Roman" w:hAnsi="Times New Roman" w:cs="Times New Roman"/>
         </w:rPr>
-        <w:t>from</w:t>
+        <w:t xml:space="preserve">from </w:t>
       </w:r>
       <w:r>
         <w:rPr>
@@ -3446,7 +3446,7 @@
         <w:rPr>
           <w:rFonts w:ascii="Times New Roman" w:hAnsi="Times New Roman" w:cs="Times New Roman"/>
         </w:rPr>
-        <w:t>. Why do we say</w:t>
+        <w:t xml:space="preserve">. Why do we say </w:t>
       </w:r>
       <w:r>
         <w:rPr>
@@ -3501,7 +3501,7 @@
         <w:rPr>
           <w:rFonts w:ascii="Times New Roman" w:hAnsi="Times New Roman" w:cs="Times New Roman"/>
         </w:rPr>
-        <w:t xml:space="preserve"> in</w:t>
+        <w:t xml:space="preserve"> in </w:t>
       </w:r>
       <w:r>
         <w:rPr>
@@ -3575,7 +3575,7 @@
         <w:rPr>
           <w:rFonts w:ascii="Times New Roman" w:hAnsi="Times New Roman" w:cs="Times New Roman"/>
         </w:rPr>
-        <w:t>, this rulership of the world, we already got this from</w:t>
+        <w:t xml:space="preserve">, this rulership of the world, we already got this from </w:t>
       </w:r>
       <w:r>
         <w:rPr>

</xml_diff>